<commit_message>
Sessione narrativa (correzioni finali): vecchio boss/vecchia organizzazione = L'chen, stato "Il tesoro del vecchio boss" -> RISOLTO
- Design doc: reso esplicito che "il vecchio boss" (sottotrama 6.1) e
  "la vecchia organizzazione" (sottotrama 6.10) sono sempre L'chen -
  il vecchio boss e' il mentore criminale defunto di Sirio, predecessore
  dell'attuale vertice; la vecchia organizzazione e' L'chen vista dal
  passato di Sirio. Chiarito alla prima occorrenza in ciascuna
  sottotrama (6.1, 6.10) e nella traccia Criminale (7.1).
- Elementi mancanti: riga "Il tesoro del vecchio boss" corretta da
  RIMANDATO a RISOLTO, allineata al design doc (gia' risolta in una
  fase precedente).
- CLAUDE.md aggiornato con entrambe le correzioni.

Chiude la sessione narrativa.

Co-Authored-By: Claude Sonnet 5 <noreply@anthropic.com>
Claude-Session: https://claude.ai/code/session_017jw4KpgqdpZNU7DgE1URQp
</commit_message>
<xml_diff>
--- a/Il_ladro_di_sabbia_design_doc.docx
+++ b/Il_ladro_di_sabbia_design_doc.docx
@@ -1026,7 +1026,7 @@
         <w:spacing w:after="160"/>
       </w:pPr>
       <w:r>
-        <w:t>Il primo mentore criminale di Sirio è morto anni fa — ma prima di morire, sentendo la fine avvicinarsi, affidò decenni di sabbia accumulata a un associato di fiducia, per motivi mai del tutto chiariti. Quell'associato non ha mai ridistribuito nulla, e vive ancora nell'ombra con quel patrimonio. Un vecchio complice del boss — rintracciabile solo tramite un contatto della vecchia rete — sa chi è e dove trovarlo. Sirio deve convincerlo, con le buone o con le cattive, a cedere ciò che gli fu affidato.</w:t>
+        <w:t>Il primo mentore criminale di Sirio, il vecchio boss di L'chen (predecessore dell'attuale vertice dell'organizzazione), è morto anni fa — ma prima di morire, sentendo la fine avvicinarsi, affidò decenni di sabbia accumulata a un associato di fiducia, per motivi mai del tutto chiariti. Quell'associato non ha mai ridistribuito nulla, e vive ancora nell'ombra con quel patrimonio. Un vecchio complice del boss — rintracciabile solo tramite un contatto della vecchia rete di L'chen — sa chi è e dove trovarlo. Sirio deve convincerlo, con le buone o con le cattive, a cedere ciò che gli fu affidato.</w:t>
       </w:r>
     </w:p>
     <w:p>
@@ -1435,7 +1435,7 @@
         <w:spacing w:after="160"/>
       </w:pPr>
       <w:r>
-        <w:t>Sirio scopre che la sua vecchia organizzazione possiede un fondo di riserva collettivo — sabbia versata da ogni membro come "assicurazione" per le famiglie in caso di morte in servizio. Rubarlo significa tradire letteralmente tutti i suoi ex colleghi, non un singolo bersaglio.</w:t>
+        <w:t>Sirio scopre che la sua vecchia organizzazione, L'chen, possiede un fondo di riserva collettivo — sabbia versata da ogni membro come "assicurazione" per le famiglie in caso di morte in servizio. Rubarlo significa tradire letteralmente tutti i suoi ex colleghi, non un singolo bersaglio.</w:t>
       </w:r>
     </w:p>
     <w:p>
@@ -1533,7 +1533,7 @@
         <w:spacing w:after="80"/>
       </w:pPr>
       <w:r>
-        <w:t xml:space="preserve">Criminale: Manovalanza → Luogotenente → Boss (tradisci/elimini/soppianti il vecchio boss)</w:t>
+        <w:t>Criminale: Manovalanza → Luogotenente → Boss (tradisci/elimini/soppianti il vecchio boss di L'chen)</w:t>
       </w:r>
     </w:p>
     <w:p>

</xml_diff>